<commit_message>
fase 3 e 4
</commit_message>
<xml_diff>
--- a/templates/contrato-promessa-compra-venda.docx
+++ b/templates/contrato-promessa-compra-venda.docx
@@ -302,7 +302,7 @@
           <w:color w:val="ff0000"/>
           <w:rtl w:val="0"/>
         </w:rPr>
-        <w:t xml:space="preserve">[EMPREENDIMENTO_NOME]</w:t>
+        <w:t xml:space="preserve">[EMPREENDIMENTO_RAZAO_SOCIAL]</w:t>
       </w:r>
       <w:r>
         <w:rPr>
@@ -341,7 +341,7 @@
           <w:color w:val="ff0000"/>
           <w:rtl w:val="0"/>
         </w:rPr>
-        <w:t xml:space="preserve">XXXXX</w:t>
+        <w:t xml:space="preserve">[EMPREENDIMENTO_CNPJ]</w:t>
       </w:r>
       <w:r>
         <w:rPr>

</xml_diff>

<commit_message>
Nova refatoração com valores a receber
</commit_message>
<xml_diff>
--- a/templates/contrato-promessa-compra-venda.docx
+++ b/templates/contrato-promessa-compra-venda.docx
@@ -321,20 +321,20 @@
         <w:rPr>
           <w:rtl w:val="0"/>
         </w:rPr>
-        <w:t xml:space="preserve">, CEP </w:t>
-      </w:r>
-      <w:r>
-        <w:rPr>
-          <w:color w:val="ff0000"/>
-          <w:rtl w:val="0"/>
-        </w:rPr>
-        <w:t xml:space="preserve">XXXX</w:t>
-      </w:r>
-      <w:r>
-        <w:rPr>
-          <w:rtl w:val="0"/>
-        </w:rPr>
-        <w:t xml:space="preserve">, CNPJ n˚ </w:t>
+        <w:t xml:space="preserve">, CEP [EMPREENDIMENTO_CEP],</w:t>
+      </w:r>
+      <w:r>
+        <w:rPr>
+          <w:color w:val="ff0000"/>
+          <w:rtl w:val="0"/>
+        </w:rPr>
+        <w:t xml:space="preserve"/>
+      </w:r>
+      <w:r>
+        <w:rPr>
+          <w:rtl w:val="0"/>
+        </w:rPr>
+        <w:t xml:space="preserve"> CNPJ n˚ </w:t>
       </w:r>
       <w:r>
         <w:rPr>
@@ -1505,7 +1505,7 @@
           <w:bCs w:val="1"/>
           <w:rtl w:val="0"/>
         </w:rPr>
-        <w:t xml:space="preserve"> HIGH TOWER EMPREENDIMENTO IMOBILIÁRIO </w:t>
+        <w:t xml:space="preserve"> [EMPREENDIMENTO_NOME] </w:t>
       </w:r>
     </w:p>
     <w:p>
@@ -1549,16 +1549,16 @@
         <w:rPr>
           <w:rtl w:val="0"/>
         </w:rPr>
-        <w:t xml:space="preserve">Número da unidade: </w:t>
-      </w:r>
-      <w:r>
-        <w:rPr>
-          <w:b w:val="1"/>
-          <w:bCs w:val="1"/>
-          <w:color w:val="ff0000"/>
-          <w:rtl w:val="0"/>
-        </w:rPr>
-        <w:t xml:space="preserve">XXX (N˚ POR EXTENSO)</w:t>
+        <w:t xml:space="preserve">Número da unidade: [UNIDADE_NUMERO] ([UNIDADE_NUMERO_EXTENSO])</w:t>
+      </w:r>
+      <w:r>
+        <w:rPr>
+          <w:b w:val="1"/>
+          <w:bCs w:val="1"/>
+          <w:color w:val="ff0000"/>
+          <w:rtl w:val="0"/>
+        </w:rPr>
+        <w:t xml:space="preserve"/>
       </w:r>
       <w:r>
         <w:rPr>
@@ -1578,24 +1578,24 @@
         <w:rPr>
           <w:rtl w:val="0"/>
         </w:rPr>
-        <w:t xml:space="preserve">Vagas: </w:t>
-      </w:r>
-      <w:r>
-        <w:rPr>
-          <w:b w:val="1"/>
-          <w:bCs w:val="1"/>
-          <w:color w:val="ff0000"/>
-          <w:rtl w:val="0"/>
-        </w:rPr>
-        <w:t xml:space="preserve">XX (N˚ POR EXTENSO)</w:t>
-      </w:r>
-      <w:r>
-        <w:rPr>
-          <w:b w:val="1"/>
-          <w:bCs w:val="1"/>
-          <w:rtl w:val="0"/>
-        </w:rPr>
-        <w:t xml:space="preserve"> vagas na garagem Nº:</w:t>
+        <w:t xml:space="preserve">Vagas: [UNIDADE_VAGAS] vaga(s) na garagem Nº: [UNIDADE_NUMEROS_VAGAS]</w:t>
+      </w:r>
+      <w:r>
+        <w:rPr>
+          <w:b w:val="1"/>
+          <w:bCs w:val="1"/>
+          <w:color w:val="ff0000"/>
+          <w:rtl w:val="0"/>
+        </w:rPr>
+        <w:t xml:space="preserve"/>
+      </w:r>
+      <w:r>
+        <w:rPr>
+          <w:b w:val="1"/>
+          <w:bCs w:val="1"/>
+          <w:rtl w:val="0"/>
+        </w:rPr>
+        <w:t xml:space="preserve"/>
       </w:r>
       <w:sdt>
         <w:sdtPr>
@@ -1610,165 +1610,165 @@
         <w:rPr>
           <w:rtl w:val="0"/>
         </w:rPr>
+        <w:t xml:space="preserve"/>
+      </w:r>
+      <w:r>
+        <w:rPr>
+          <w:b w:val="1"/>
+          <w:bCs w:val="1"/>
+          <w:color w:val="ff0000"/>
+          <w:rtl w:val="0"/>
+        </w:rPr>
+        <w:t xml:space="preserve"/>
+      </w:r>
+      <w:r>
+        <w:rPr>
+          <w:color w:val="ff0000"/>
+          <w:rtl w:val="0"/>
+        </w:rPr>
+        <w:t xml:space="preserve"/>
+      </w:r>
+      <w:r>
+        <w:rPr>
+          <w:b w:val="1"/>
+          <w:bCs w:val="1"/>
+          <w:color w:val="ff0000"/>
+          <w:rtl w:val="0"/>
+        </w:rPr>
+        <w:t xml:space="preserve"/>
+      </w:r>
+      <w:r>
+        <w:rPr>
+          <w:color w:val="ff0000"/>
+          <w:rtl w:val="0"/>
+        </w:rPr>
+        <w:t xml:space="preserve"/>
+      </w:r>
+      <w:r>
+        <w:rPr>
+          <w:b w:val="1"/>
+          <w:bCs w:val="1"/>
+          <w:color w:val="ff0000"/>
+          <w:rtl w:val="0"/>
+        </w:rPr>
+        <w:t xml:space="preserve"/>
+      </w:r>
+      <w:commentRangeEnd w:id="2"/>
+      <w:r>
+        <w:commentReference w:id="2"/>
+      </w:r>
+      <w:r>
+        <w:rPr>
+          <w:rtl w:val="0"/>
+        </w:rPr>
+      </w:r>
+    </w:p>
+    <w:p>
+      <w:pPr>
+        <w:spacing w:after="160" w:lineRule="auto"/>
+        <w:jc w:val="both"/>
+        <w:rPr>
+          <w:b w:val="1"/>
+          <w:bCs w:val="1"/>
+          <w:color w:val="ff0000"/>
+        </w:rPr>
+      </w:pPr>
+      <w:r>
+        <w:rPr>
+          <w:rtl w:val="0"/>
+        </w:rPr>
+        <w:t xml:space="preserve">Área privativa: [UNIDADE_AREA_PRIVATIVA] m²</w:t>
+      </w:r>
+      <w:r>
+        <w:rPr>
+          <w:b w:val="1"/>
+          <w:bCs w:val="1"/>
+          <w:color w:val="ff0000"/>
+          <w:rtl w:val="0"/>
+        </w:rPr>
+        <w:t xml:space="preserve"/>
+      </w:r>
+      <w:r>
+        <w:rPr>
+          <w:b w:val="1"/>
+          <w:bCs w:val="1"/>
+          <w:rtl w:val="0"/>
+        </w:rPr>
+        <w:tab/>
+        <w:tab/>
+        <w:tab/>
+        <w:tab/>
+      </w:r>
+      <w:r>
+        <w:rPr>
+          <w:rtl w:val="0"/>
+        </w:rPr>
+        <w:t xml:space="preserve">Área de Construção: [UNIDADE_AREA_CONSTRUCAO] m²</w:t>
+      </w:r>
+      <w:r>
+        <w:rPr>
+          <w:b w:val="1"/>
+          <w:bCs w:val="1"/>
+          <w:color w:val="ff0000"/>
+          <w:rtl w:val="0"/>
+        </w:rPr>
+        <w:t xml:space="preserve"/>
+      </w:r>
+    </w:p>
+    <w:p>
+      <w:pPr>
+        <w:spacing w:after="160" w:lineRule="auto"/>
+        <w:jc w:val="both"/>
+        <w:rPr>
+          <w:color w:val="ff0000"/>
+        </w:rPr>
+      </w:pPr>
+      <w:r>
+        <w:rPr>
+          <w:rtl w:val="0"/>
+        </w:rPr>
+        <w:t xml:space="preserve">Fração ideal: [UNIDADE_FRACAO_IDEAL]</w:t>
+      </w:r>
+      <w:r>
+        <w:rPr>
+          <w:b w:val="1"/>
+          <w:bCs w:val="1"/>
+          <w:color w:val="ff0000"/>
+          <w:rtl w:val="0"/>
+        </w:rPr>
+        <w:t xml:space="preserve"/>
+      </w:r>
+      <w:r>
+        <w:rPr>
+          <w:rtl w:val="0"/>
+        </w:rPr>
+      </w:r>
+    </w:p>
+    <w:p>
+      <w:pPr>
+        <w:spacing w:after="160" w:line="259" w:lineRule="auto"/>
+        <w:jc w:val="both"/>
+        <w:rPr/>
+      </w:pPr>
+      <w:r>
+        <w:rPr>
+          <w:rtl w:val="0"/>
+        </w:rPr>
+        <w:t xml:space="preserve">Descrição de Planta: [UNIDADE_DESCRICAO_PLANTA]</w:t>
+      </w:r>
+      <w:r>
+        <w:rPr>
+          <w:color w:val="ff0000"/>
+          <w:rtl w:val="0"/>
+        </w:rPr>
+        <w:t xml:space="preserve"/>
+      </w:r>
+      <w:r>
+        <w:rPr>
+          <w:rtl w:val="0"/>
+        </w:rPr>
         <w:t xml:space="preserve"> </w:t>
       </w:r>
-      <w:r>
-        <w:rPr>
-          <w:b w:val="1"/>
-          <w:bCs w:val="1"/>
-          <w:color w:val="ff0000"/>
-          <w:rtl w:val="0"/>
-        </w:rPr>
-        <w:t xml:space="preserve">XX</w:t>
-      </w:r>
-      <w:r>
-        <w:rPr>
-          <w:color w:val="ff0000"/>
-          <w:rtl w:val="0"/>
-        </w:rPr>
-        <w:t xml:space="preserve"> </w:t>
-      </w:r>
-      <w:r>
-        <w:rPr>
-          <w:b w:val="1"/>
-          <w:bCs w:val="1"/>
-          <w:color w:val="ff0000"/>
-          <w:rtl w:val="0"/>
-        </w:rPr>
-        <w:t xml:space="preserve">(N˚ POR EXTENSO)</w:t>
-      </w:r>
-      <w:r>
-        <w:rPr>
-          <w:color w:val="ff0000"/>
-          <w:rtl w:val="0"/>
-        </w:rPr>
-        <w:t xml:space="preserve"> e </w:t>
-      </w:r>
-      <w:r>
-        <w:rPr>
-          <w:b w:val="1"/>
-          <w:bCs w:val="1"/>
-          <w:color w:val="ff0000"/>
-          <w:rtl w:val="0"/>
-        </w:rPr>
-        <w:t xml:space="preserve">XX (N˚ POR EXTENSO)</w:t>
-      </w:r>
-      <w:commentRangeEnd w:id="2"/>
-      <w:r>
-        <w:commentReference w:id="2"/>
-      </w:r>
-      <w:r>
-        <w:rPr>
-          <w:rtl w:val="0"/>
-        </w:rPr>
-      </w:r>
-    </w:p>
-    <w:p>
-      <w:pPr>
-        <w:spacing w:after="160" w:lineRule="auto"/>
-        <w:jc w:val="both"/>
-        <w:rPr>
-          <w:b w:val="1"/>
-          <w:bCs w:val="1"/>
-          <w:color w:val="ff0000"/>
-        </w:rPr>
-      </w:pPr>
-      <w:r>
-        <w:rPr>
-          <w:rtl w:val="0"/>
-        </w:rPr>
-        <w:t xml:space="preserve">Área privativa: </w:t>
-      </w:r>
-      <w:r>
-        <w:rPr>
-          <w:b w:val="1"/>
-          <w:bCs w:val="1"/>
-          <w:color w:val="ff0000"/>
-          <w:rtl w:val="0"/>
-        </w:rPr>
-        <w:t xml:space="preserve">XXXX m²</w:t>
-      </w:r>
-      <w:r>
-        <w:rPr>
-          <w:b w:val="1"/>
-          <w:bCs w:val="1"/>
-          <w:rtl w:val="0"/>
-        </w:rPr>
-        <w:tab/>
-        <w:tab/>
-        <w:tab/>
-        <w:tab/>
-      </w:r>
-      <w:r>
-        <w:rPr>
-          <w:rtl w:val="0"/>
-        </w:rPr>
-        <w:t xml:space="preserve">Área de Construção: </w:t>
-      </w:r>
-      <w:r>
-        <w:rPr>
-          <w:b w:val="1"/>
-          <w:bCs w:val="1"/>
-          <w:color w:val="ff0000"/>
-          <w:rtl w:val="0"/>
-        </w:rPr>
-        <w:t xml:space="preserve">XXXXX m²</w:t>
-      </w:r>
-    </w:p>
-    <w:p>
-      <w:pPr>
-        <w:spacing w:after="160" w:lineRule="auto"/>
-        <w:jc w:val="both"/>
-        <w:rPr>
-          <w:color w:val="ff0000"/>
-        </w:rPr>
-      </w:pPr>
-      <w:r>
-        <w:rPr>
-          <w:rtl w:val="0"/>
-        </w:rPr>
-        <w:t xml:space="preserve">Fração ideal: </w:t>
-      </w:r>
-      <w:r>
-        <w:rPr>
-          <w:b w:val="1"/>
-          <w:bCs w:val="1"/>
-          <w:color w:val="ff0000"/>
-          <w:rtl w:val="0"/>
-        </w:rPr>
-        <w:t xml:space="preserve">XXXXXX</w:t>
-      </w:r>
-      <w:r>
-        <w:rPr>
-          <w:rtl w:val="0"/>
-        </w:rPr>
-      </w:r>
-    </w:p>
-    <w:p>
-      <w:pPr>
-        <w:spacing w:after="160" w:line="259" w:lineRule="auto"/>
-        <w:jc w:val="both"/>
-        <w:rPr/>
-      </w:pPr>
-      <w:r>
-        <w:rPr>
-          <w:rtl w:val="0"/>
-        </w:rPr>
-        <w:t xml:space="preserve">Descrição de Planta: </w:t>
-      </w:r>
-      <w:r>
-        <w:rPr>
-          <w:color w:val="ff0000"/>
-          <w:rtl w:val="0"/>
-        </w:rPr>
-        <w:t xml:space="preserve">3 (três) quartos, sendo 1(uma) suíte, 1(um) banho social, 1(uma) cozinha, 1(uma) área de serviço, 1(uma) sala de estar e 1(uma) sala de jantar conjugadas, 1(uma) área técnica e 1(uma) varanda gourmet.</w:t>
-      </w:r>
-      <w:r>
-        <w:rPr>
-          <w:rtl w:val="0"/>
-        </w:rPr>
-        <w:t xml:space="preserve"> </w:t>
-      </w:r>
     </w:p>
     <w:p>
       <w:pPr>
@@ -1835,22 +1835,22 @@
         <w:rPr>
           <w:rtl w:val="0"/>
         </w:rPr>
-        <w:t xml:space="preserve"> O preço total a ser pago pela unidade é </w:t>
-      </w:r>
-      <w:r>
-        <w:rPr>
-          <w:b w:val="1"/>
-          <w:bCs w:val="1"/>
-          <w:color w:val="ff0000"/>
-          <w:rtl w:val="0"/>
-        </w:rPr>
-        <w:t xml:space="preserve">R$ XXXXXXX (N˚ POR EXTENSO)</w:t>
-      </w:r>
-      <w:r>
-        <w:rPr>
-          <w:rtl w:val="0"/>
-        </w:rPr>
-        <w:t xml:space="preserve">, e será pago pelo(s) COMPRADOR(ES) de forma parcelada.</w:t>
+        <w:t xml:space="preserve"> O preço total a ser pago pela unidade é [PRECO_TOTAL] ([PRECO_TOTAL_EXTENSO]), e será pago pelo(s) COMPRADOR(ES) de forma [FORMA_AQUISICAO].</w:t>
+      </w:r>
+      <w:r>
+        <w:rPr>
+          <w:b w:val="1"/>
+          <w:bCs w:val="1"/>
+          <w:color w:val="ff0000"/>
+          <w:rtl w:val="0"/>
+        </w:rPr>
+        <w:t xml:space="preserve"/>
+      </w:r>
+      <w:r>
+        <w:rPr>
+          <w:rtl w:val="0"/>
+        </w:rPr>
+        <w:t xml:space="preserve"/>
       </w:r>
     </w:p>
     <w:p>
@@ -4068,20 +4068,20 @@
           <w:bCs w:val="1"/>
           <w:rtl w:val="0"/>
         </w:rPr>
-        <w:t xml:space="preserve">Titularidade:      </w:t>
-      </w:r>
-      <w:r>
-        <w:rPr>
-          <w:color w:val="ff0000"/>
-          <w:rtl w:val="0"/>
-        </w:rPr>
-        <w:t xml:space="preserve">FLOR DO GUARUJA EMPREENDIMENTO IMOBILIARIO SPE LTDA</w:t>
-      </w:r>
-      <w:r>
-        <w:rPr>
-          <w:rtl w:val="0"/>
-        </w:rPr>
-        <w:t xml:space="preserve">.</w:t>
+        <w:t xml:space="preserve">Titularidade:      [EMPREENDIMENTO_RAZAO_SOCIAL].</w:t>
+      </w:r>
+      <w:r>
+        <w:rPr>
+          <w:color w:val="ff0000"/>
+          <w:rtl w:val="0"/>
+        </w:rPr>
+        <w:t xml:space="preserve"/>
+      </w:r>
+      <w:r>
+        <w:rPr>
+          <w:rtl w:val="0"/>
+        </w:rPr>
+        <w:t xml:space="preserve"/>
       </w:r>
     </w:p>
     <w:p>
@@ -6909,28 +6909,28 @@
           <w:bCs w:val="1"/>
           <w:rtl w:val="0"/>
         </w:rPr>
-        <w:t xml:space="preserve">1.1.</w:t>
-      </w:r>
-      <w:r>
-        <w:rPr>
-          <w:rtl w:val="0"/>
-        </w:rPr>
-        <w:tab/>
-        <w:t xml:space="preserve">A VENDEDORA realizará a construção e a incorporação imobiliária do empreendimento denominado </w:t>
-      </w:r>
-      <w:r>
-        <w:rPr>
-          <w:b w:val="1"/>
-          <w:bCs w:val="1"/>
-          <w:rtl w:val="0"/>
-        </w:rPr>
-        <w:t xml:space="preserve">HIGH TOWER EMPREENDIMENTO IMOBILIÁRIO SPE LTDA</w:t>
-      </w:r>
-      <w:r>
-        <w:rPr>
-          <w:rtl w:val="0"/>
-        </w:rPr>
-        <w:t xml:space="preserve">, nos termos da Lei Federal 4.591/64 e suas respectivas alterações, a ser construído no terreno indicado no item II do Quadro Resumo.</w:t>
+        <w:t xml:space="preserve">1.1.A VENDEDORA realizará a construção e a incorporação imobiliária do empreendimento denominado [EMPREENDIMENTO_RAZAO_SOCIAL], nos termos da Lei Federal 4.591/64 e suas respectivas alterações, a ser construído no terreno indicado no item II do Quadro Resumo.</w:t>
+      </w:r>
+      <w:r>
+        <w:rPr>
+          <w:rtl w:val="0"/>
+        </w:rPr>
+        <w:tab/>
+        <w:t xml:space="preserve"/>
+      </w:r>
+      <w:r>
+        <w:rPr>
+          <w:b w:val="1"/>
+          <w:bCs w:val="1"/>
+          <w:rtl w:val="0"/>
+        </w:rPr>
+        <w:t xml:space="preserve"/>
+      </w:r>
+      <w:r>
+        <w:rPr>
+          <w:rtl w:val="0"/>
+        </w:rPr>
+        <w:t xml:space="preserve"/>
       </w:r>
     </w:p>
     <w:p>
@@ -6967,53 +6967,53 @@
           <w:bCs w:val="1"/>
           <w:rtl w:val="0"/>
         </w:rPr>
-        <w:t xml:space="preserve">1.3.</w:t>
-      </w:r>
-      <w:r>
-        <w:rPr>
-          <w:rtl w:val="0"/>
-        </w:rPr>
-        <w:tab/>
-        <w:t xml:space="preserve">O INCORPORADOR está autorizado a concluir os negócios pertinentes à alienação das frações ideais do terreno constituído pelos</w:t>
-      </w:r>
-      <w:r>
-        <w:rPr>
-          <w:color w:val="ff0000"/>
-          <w:rtl w:val="0"/>
-        </w:rPr>
-        <w:t xml:space="preserve"> lotes 6(seis) e 8(oito), da quadra 10, situados na rua Flor do Guarujá nº 47, bairro Jardins, na cidade de Aracruz - ES, com áreas de 378(trezentos e setenta e oito) metros quadrados cada um</w:t>
-      </w:r>
-      <w:r>
-        <w:rPr>
-          <w:rtl w:val="0"/>
-        </w:rPr>
-        <w:t xml:space="preserve">, limites e confrontações de acordo com a planta cadastral da cidade, objeto da matrícula </w:t>
-      </w:r>
-      <w:r>
-        <w:rPr>
-          <w:color w:val="ff0000"/>
-          <w:rtl w:val="0"/>
-        </w:rPr>
-        <w:t xml:space="preserve">nº 22.074  do Cartório do 1º Ofício de Registro de Imóveis, Títulos e Documentos e Pessoas Jurídicas de Aracruz, Espírito Santo</w:t>
-      </w:r>
-      <w:r>
-        <w:rPr>
-          <w:rtl w:val="0"/>
-        </w:rPr>
-        <w:t xml:space="preserve">, para o fim especial de promover a incorporação e a construção do </w:t>
-      </w:r>
-      <w:r>
-        <w:rPr>
-          <w:color w:val="ff0000"/>
-          <w:rtl w:val="0"/>
-        </w:rPr>
-        <w:t xml:space="preserve">EDIFÍCIO FLOR DO GUARUJÁ</w:t>
-      </w:r>
-      <w:r>
-        <w:rPr>
-          <w:rtl w:val="0"/>
-        </w:rPr>
-        <w:t xml:space="preserve">, conforme contrato de incorporação  cuja cópia está arquivada junto com o memorial de incorporação.</w:t>
+        <w:t xml:space="preserve">1.3.O INCORPORADOR está autorizado a concluir os negócios pertinentes à alienação das frações ideais do terreno constituído pelos lotes 6(seis) e 8(oito), da quadra 10, situados na rua Flor do Guarujá nº 47, bairro Jardins, na cidade de Aracruz - ES, com áreas de 378(trezentos e setenta e oito) metros quadrados cada um, limites e confrontações de acordo com a planta cadastral da cidade, objeto da matrícula nº 22.074  do Cartório do 1º Ofício de Registro de Imóveis, Títulos e Documentos e Pessoas Jurídicas de Aracruz, Espírito Santo, para o fim especial de promover a incorporação e a construção do EDIFÍCIO [EMPREENDIMENTO_NOME], conforme contrato de incorporação  cuja cópia está arquivada junto com o memorial de incorporação.</w:t>
+      </w:r>
+      <w:r>
+        <w:rPr>
+          <w:rtl w:val="0"/>
+        </w:rPr>
+        <w:tab/>
+        <w:t xml:space="preserve"/>
+      </w:r>
+      <w:r>
+        <w:rPr>
+          <w:color w:val="ff0000"/>
+          <w:rtl w:val="0"/>
+        </w:rPr>
+        <w:t xml:space="preserve"/>
+      </w:r>
+      <w:r>
+        <w:rPr>
+          <w:rtl w:val="0"/>
+        </w:rPr>
+        <w:t xml:space="preserve"/>
+      </w:r>
+      <w:r>
+        <w:rPr>
+          <w:color w:val="ff0000"/>
+          <w:rtl w:val="0"/>
+        </w:rPr>
+        <w:t xml:space="preserve"/>
+      </w:r>
+      <w:r>
+        <w:rPr>
+          <w:rtl w:val="0"/>
+        </w:rPr>
+        <w:t xml:space="preserve"/>
+      </w:r>
+      <w:r>
+        <w:rPr>
+          <w:color w:val="ff0000"/>
+          <w:rtl w:val="0"/>
+        </w:rPr>
+        <w:t xml:space="preserve"/>
+      </w:r>
+      <w:r>
+        <w:rPr>
+          <w:rtl w:val="0"/>
+        </w:rPr>
+        <w:t xml:space="preserve"/>
       </w:r>
     </w:p>
     <w:p>

</xml_diff>